<commit_message>
WIP: nil-design — Inter + Source Serif 4, legacy fonts moved aside
In-progress work integrating nil's typography spec. Open questions
captured in followups.md (heading depth, baseline alignment, slide mode,
paper color, sector palettes, font retention).

Co-Authored-By: Claude Opus 4.7 (1M context) <noreply@anthropic.com>
</commit_message>
<xml_diff>
--- a/assets/gl-report.docx
+++ b/assets/gl-report.docx
@@ -2758,15 +2758,15 @@
   <w:docDefaults>
     <w:rPrDefault>
       <w:rPr>
-        <w:rFonts w:ascii="Source Sans 3" w:hAnsi="Source Sans 3" w:eastAsia="Source Sans 3" w:cs="Source Sans 3"/>
-        <w:sz w:val="22"/>
-        <w:szCs w:val="22"/>
-        <w:color w:val="333333"/>
+        <w:rFonts w:ascii="Inter" w:hAnsi="Inter" w:eastAsia="Inter" w:cs="Inter"/>
+        <w:sz w:val="24"/>
+        <w:szCs w:val="24"/>
+        <w:color w:val="2C2823"/>
       </w:rPr>
     </w:rPrDefault>
     <w:pPrDefault>
       <w:pPr>
-        <w:spacing w:after="120" w:line="300" w:lineRule="auto"/>
+        <w:spacing w:after="120" w:line="384" w:lineRule="auto"/>
         <w:jc w:val="both"/>
       </w:pPr>
     </w:pPrDefault>
@@ -3158,10 +3158,10 @@
       <w:jc w:val="both"/>
     </w:pPr>
     <w:rPr>
-      <w:rFonts w:ascii="Source Sans 3" w:hAnsi="Source Sans 3" w:eastAsia="Source Sans 3" w:cs="Source Sans 3"/>
-      <w:sz w:val="22"/>
-      <w:szCs w:val="22"/>
-      <w:color w:val="333333"/>
+      <w:rFonts w:ascii="Inter" w:hAnsi="Inter" w:eastAsia="Inter" w:cs="Inter"/>
+      <w:sz w:val="24"/>
+      <w:szCs w:val="24"/>
+      <w:color w:val="2C2823"/>
     </w:rPr>
   </w:style>
   <w:style w:type="paragraph" w:styleId="Heading1">
@@ -3176,16 +3176,16 @@
       <w:pageBreakBefore/>
       <w:keepNext/>
       <w:keepLines/>
-      <w:spacing w:before="480" w:after="120"/>
+      <w:spacing w:before="480" w:after="160"/>
       <w:outlineLvl w:val="0"/>
     </w:pPr>
     <w:rPr>
       <w:b/>
       <w:bCs/>
-      <w:rFonts w:ascii="Source Sans 3" w:hAnsi="Source Sans 3" w:eastAsia="Source Sans 3" w:cs="Source Sans 3"/>
-      <w:sz w:val="43"/>
-      <w:szCs w:val="43"/>
-      <w:color w:val="333333"/>
+      <w:rFonts w:ascii="Source Serif 4" w:hAnsi="Source Serif 4" w:eastAsia="Source Serif 4" w:cs="Source Serif 4"/>
+      <w:sz w:val="68"/>
+      <w:szCs w:val="68"/>
+      <w:color w:val="1A1714"/>
     </w:rPr>
   </w:style>
   <w:style w:type="paragraph" w:styleId="Heading2">
@@ -3200,16 +3200,16 @@
     <w:pPr>
       <w:keepNext/>
       <w:keepLines/>
-      <w:spacing w:before="360" w:after="120"/>
+      <w:spacing w:before="560" w:after="160"/>
       <w:outlineLvl w:val="1"/>
     </w:pPr>
     <w:rPr>
       <w:b/>
       <w:bCs/>
-      <w:rFonts w:ascii="Source Sans 3" w:hAnsi="Source Sans 3" w:eastAsia="Source Sans 3" w:cs="Source Sans 3"/>
-      <w:sz w:val="34"/>
-      <w:szCs w:val="34"/>
-      <w:color w:val="333333"/>
+      <w:rFonts w:ascii="Source Serif 4" w:hAnsi="Source Serif 4" w:eastAsia="Source Serif 4" w:cs="Source Serif 4"/>
+      <w:sz w:val="40"/>
+      <w:szCs w:val="40"/>
+      <w:color w:val="1A1714"/>
     </w:rPr>
   </w:style>
   <w:style w:type="paragraph" w:styleId="Heading3">
@@ -3224,16 +3224,16 @@
     <w:pPr>
       <w:keepNext/>
       <w:keepLines/>
-      <w:spacing w:before="240" w:after="120"/>
+      <w:spacing w:before="280" w:after="160"/>
       <w:outlineLvl w:val="2"/>
     </w:pPr>
     <w:rPr>
       <w:b/>
       <w:bCs/>
-      <w:rFonts w:ascii="Source Sans 3" w:hAnsi="Source Sans 3" w:eastAsia="Source Sans 3" w:cs="Source Sans 3"/>
+      <w:rFonts w:ascii="Source Serif 4" w:hAnsi="Source Serif 4" w:eastAsia="Source Serif 4" w:cs="Source Serif 4"/>
       <w:sz w:val="28"/>
       <w:szCs w:val="28"/>
-      <w:color w:val="333333"/>
+      <w:color w:val="1A1714"/>
     </w:rPr>
   </w:style>
   <w:style w:type="paragraph" w:styleId="Heading4">
@@ -3254,10 +3254,10 @@
     <w:rPr>
       <w:b/>
       <w:bCs/>
-      <w:rFonts w:ascii="Source Sans 3" w:hAnsi="Source Sans 3" w:eastAsia="Source Sans 3" w:cs="Source Sans 3"/>
-      <w:sz w:val="22"/>
-      <w:szCs w:val="22"/>
-      <w:color w:val="333333"/>
+      <w:rFonts w:ascii="Inter" w:hAnsi="Inter" w:eastAsia="Inter" w:cs="Inter"/>
+      <w:sz w:val="24"/>
+      <w:szCs w:val="24"/>
+      <w:color w:val="6B645A"/>
     </w:rPr>
   </w:style>
   <w:style w:type="paragraph" w:styleId="Heading5">
@@ -3277,10 +3277,10 @@
       <w:outlineLvl w:val="4"/>
     </w:pPr>
     <w:rPr>
-      <w:rFonts w:ascii="Source Sans 3" w:hAnsi="Source Sans 3" w:eastAsia="Source Sans 3" w:cs="Source Sans 3"/>
-      <w:sz w:val="22"/>
-      <w:szCs w:val="22"/>
-      <w:color w:val="7c7c7c"/>
+      <w:rFonts w:ascii="Inter" w:hAnsi="Inter" w:eastAsia="Inter" w:cs="Inter"/>
+      <w:sz w:val="24"/>
+      <w:szCs w:val="24"/>
+      <w:color w:val="6B645A"/>
     </w:rPr>
   </w:style>
   <w:style w:type="paragraph" w:styleId="Heading6">
@@ -3302,10 +3302,10 @@
     <w:rPr>
       <w:i/>
       <w:iCs/>
-      <w:rFonts w:ascii="Source Sans 3" w:hAnsi="Source Sans 3" w:eastAsia="Source Sans 3" w:cs="Source Sans 3"/>
-      <w:sz w:val="22"/>
-      <w:szCs w:val="22"/>
-      <w:color w:val="7c7c7c"/>
+      <w:rFonts w:ascii="Inter" w:hAnsi="Inter" w:eastAsia="Inter" w:cs="Inter"/>
+      <w:sz w:val="24"/>
+      <w:szCs w:val="24"/>
+      <w:color w:val="6B645A"/>
     </w:rPr>
   </w:style>
   <w:style w:type="paragraph" w:styleId="Heading7">
@@ -3409,13 +3409,13 @@
     <w:rPr>
       <w:b/>
       <w:bCs/>
-      <w:rFonts w:ascii="Source Sans 3" w:hAnsi="Source Sans 3" w:eastAsia="Source Sans 3" w:cs="Source Sans 3"/>
-      <w:sz w:val="43"/>
-      <w:szCs w:val="43"/>
-      <w:color w:val="333333"/>
-    </w:rPr>
-    <w:pPr>
-      <w:spacing w:before="480" w:after="120"/>
+      <w:rFonts w:ascii="Source Serif 4" w:hAnsi="Source Serif 4" w:eastAsia="Source Serif 4" w:cs="Source Serif 4"/>
+      <w:sz w:val="68"/>
+      <w:szCs w:val="68"/>
+      <w:color w:val="1A1714"/>
+    </w:rPr>
+    <w:pPr>
+      <w:spacing w:before="480" w:after="160"/>
     </w:pPr>
   </w:style>
   <w:style w:type="character" w:customStyle="1" w:styleId="Heading2Char">
@@ -3427,13 +3427,13 @@
     <w:rPr>
       <w:b/>
       <w:bCs/>
-      <w:rFonts w:ascii="Source Sans 3" w:hAnsi="Source Sans 3" w:eastAsia="Source Sans 3" w:cs="Source Sans 3"/>
-      <w:sz w:val="34"/>
-      <w:szCs w:val="34"/>
-      <w:color w:val="333333"/>
-    </w:rPr>
-    <w:pPr>
-      <w:spacing w:before="360" w:after="120"/>
+      <w:rFonts w:ascii="Source Serif 4" w:hAnsi="Source Serif 4" w:eastAsia="Source Serif 4" w:cs="Source Serif 4"/>
+      <w:sz w:val="40"/>
+      <w:szCs w:val="40"/>
+      <w:color w:val="1A1714"/>
+    </w:rPr>
+    <w:pPr>
+      <w:spacing w:before="560" w:after="160"/>
     </w:pPr>
   </w:style>
   <w:style w:type="character" w:customStyle="1" w:styleId="Heading3Char">
@@ -3445,13 +3445,13 @@
     <w:rPr>
       <w:b/>
       <w:bCs/>
-      <w:rFonts w:ascii="Source Sans 3" w:hAnsi="Source Sans 3" w:eastAsia="Source Sans 3" w:cs="Source Sans 3"/>
+      <w:rFonts w:ascii="Source Serif 4" w:hAnsi="Source Serif 4" w:eastAsia="Source Serif 4" w:cs="Source Serif 4"/>
       <w:sz w:val="28"/>
       <w:szCs w:val="28"/>
-      <w:color w:val="333333"/>
-    </w:rPr>
-    <w:pPr>
-      <w:spacing w:before="240" w:after="120"/>
+      <w:color w:val="1A1714"/>
+    </w:rPr>
+    <w:pPr>
+      <w:spacing w:before="280" w:after="160"/>
     </w:pPr>
   </w:style>
   <w:style w:type="character" w:customStyle="1" w:styleId="Heading4Char">
@@ -3463,10 +3463,10 @@
     <w:rPr>
       <w:b/>
       <w:bCs/>
-      <w:rFonts w:ascii="Source Sans 3" w:hAnsi="Source Sans 3" w:eastAsia="Source Sans 3" w:cs="Source Sans 3"/>
-      <w:sz w:val="22"/>
-      <w:szCs w:val="22"/>
-      <w:color w:val="333333"/>
+      <w:rFonts w:ascii="Inter" w:hAnsi="Inter" w:eastAsia="Inter" w:cs="Inter"/>
+      <w:sz w:val="24"/>
+      <w:szCs w:val="24"/>
+      <w:color w:val="6B645A"/>
     </w:rPr>
     <w:pPr>
       <w:spacing w:before="240" w:after="120"/>
@@ -3480,10 +3480,10 @@
     <w:semiHidden/>
     <w:rsid w:val="00B04F2E"/>
     <w:rPr>
-      <w:rFonts w:ascii="Source Sans 3" w:hAnsi="Source Sans 3" w:eastAsia="Source Sans 3" w:cs="Source Sans 3"/>
-      <w:sz w:val="22"/>
-      <w:szCs w:val="22"/>
-      <w:color w:val="7c7c7c"/>
+      <w:rFonts w:ascii="Inter" w:hAnsi="Inter" w:eastAsia="Inter" w:cs="Inter"/>
+      <w:sz w:val="24"/>
+      <w:szCs w:val="24"/>
+      <w:color w:val="6B645A"/>
     </w:rPr>
     <w:pPr>
       <w:spacing w:before="240" w:after="120"/>
@@ -3499,10 +3499,10 @@
     <w:rPr>
       <w:i/>
       <w:iCs/>
-      <w:rFonts w:ascii="Source Sans 3" w:hAnsi="Source Sans 3" w:eastAsia="Source Sans 3" w:cs="Source Sans 3"/>
-      <w:sz w:val="22"/>
-      <w:szCs w:val="22"/>
-      <w:color w:val="7c7c7c"/>
+      <w:rFonts w:ascii="Inter" w:hAnsi="Inter" w:eastAsia="Inter" w:cs="Inter"/>
+      <w:sz w:val="24"/>
+      <w:szCs w:val="24"/>
+      <w:color w:val="6B645A"/>
     </w:rPr>
     <w:pPr>
       <w:spacing w:before="240" w:after="120"/>
@@ -3555,16 +3555,14 @@
     <w:qFormat/>
     <w:rsid w:val="003113FB"/>
     <w:pPr>
-      <w:spacing w:after="120" w:line="276" w:lineRule="auto"/>
+      <w:spacing w:after="480" w:line="276" w:lineRule="auto"/>
       <w:jc w:val="center"/>
     </w:pPr>
     <w:rPr>
-      <w:b/>
-      <w:bCs/>
-      <w:rFonts w:ascii="Source Sans 3" w:hAnsi="Source Sans 3" w:eastAsia="Source Sans 3" w:cs="Source Sans 3"/>
-      <w:sz w:val="52"/>
-      <w:szCs w:val="52"/>
-      <w:color w:val="333333"/>
+      <w:rFonts w:ascii="Source Serif 4" w:hAnsi="Source Serif 4" w:eastAsia="Source Serif 4" w:cs="Source Serif 4"/>
+      <w:sz w:val="112"/>
+      <w:szCs w:val="112"/>
+      <w:color w:val="1A1714"/>
     </w:rPr>
   </w:style>
   <w:style w:type="character" w:customStyle="1" w:styleId="TitleChar">
@@ -3574,15 +3572,13 @@
     <w:uiPriority w:val="10"/>
     <w:rsid w:val="003113FB"/>
     <w:rPr>
-      <w:b/>
-      <w:bCs/>
-      <w:rFonts w:ascii="Source Sans 3" w:hAnsi="Source Sans 3" w:eastAsia="Source Sans 3" w:cs="Source Sans 3"/>
-      <w:sz w:val="52"/>
-      <w:szCs w:val="52"/>
-      <w:color w:val="333333"/>
-    </w:rPr>
-    <w:pPr>
-      <w:spacing w:after="120"/>
+      <w:rFonts w:ascii="Source Serif 4" w:hAnsi="Source Serif 4" w:eastAsia="Source Serif 4" w:cs="Source Serif 4"/>
+      <w:sz w:val="112"/>
+      <w:szCs w:val="112"/>
+      <w:color w:val="1A1714"/>
+    </w:rPr>
+    <w:pPr>
+      <w:spacing w:after="480"/>
     </w:pPr>
   </w:style>
   <w:style w:type="paragraph" w:styleId="Subtitle">
@@ -3598,10 +3594,10 @@
       <w:jc w:val="center"/>
     </w:pPr>
     <w:rPr>
-      <w:rFonts w:ascii="Source Sans 3" w:hAnsi="Source Sans 3" w:eastAsia="Source Sans 3" w:cs="Source Sans 3"/>
-      <w:sz w:val="32"/>
-      <w:szCs w:val="32"/>
-      <w:color w:val="7c7c7c"/>
+      <w:rFonts w:ascii="Source Serif 4" w:hAnsi="Source Serif 4" w:eastAsia="Source Serif 4" w:cs="Source Serif 4"/>
+      <w:sz w:val="34"/>
+      <w:szCs w:val="34"/>
+      <w:color w:val="2C2823"/>
     </w:rPr>
   </w:style>
   <w:style w:type="character" w:customStyle="1" w:styleId="SubtitleChar">
@@ -3611,10 +3607,10 @@
     <w:uiPriority w:val="11"/>
     <w:rsid w:val="003113FB"/>
     <w:rPr>
-      <w:rFonts w:ascii="Source Sans 3" w:hAnsi="Source Sans 3" w:eastAsia="Source Sans 3" w:cs="Source Sans 3"/>
-      <w:sz w:val="32"/>
-      <w:szCs w:val="32"/>
-      <w:color w:val="7c7c7c"/>
+      <w:rFonts w:ascii="Source Serif 4" w:hAnsi="Source Serif 4" w:eastAsia="Source Serif 4" w:cs="Source Serif 4"/>
+      <w:sz w:val="34"/>
+      <w:szCs w:val="34"/>
+      <w:color w:val="2C2823"/>
     </w:rPr>
     <w:pPr>
       <w:spacing w:after="240"/>
@@ -3635,10 +3631,10 @@
     <w:rPr>
       <w:i/>
       <w:iCs/>
-      <w:rFonts w:ascii="Source Sans 3" w:hAnsi="Source Sans 3" w:eastAsia="Source Sans 3" w:cs="Source Sans 3"/>
-      <w:sz w:val="22"/>
-      <w:szCs w:val="22"/>
-      <w:color w:val="7c7c7c"/>
+      <w:rFonts w:ascii="Source Serif 4" w:hAnsi="Source Serif 4" w:eastAsia="Source Serif 4" w:cs="Source Serif 4"/>
+      <w:sz w:val="28"/>
+      <w:szCs w:val="28"/>
+      <w:color w:val="2C2823"/>
     </w:rPr>
   </w:style>
   <w:style w:type="character" w:customStyle="1" w:styleId="QuoteChar">
@@ -3650,10 +3646,10 @@
     <w:rPr>
       <w:i/>
       <w:iCs/>
-      <w:rFonts w:ascii="Source Sans 3" w:hAnsi="Source Sans 3" w:eastAsia="Source Sans 3" w:cs="Source Sans 3"/>
-      <w:sz w:val="22"/>
-      <w:szCs w:val="22"/>
-      <w:color w:val="7c7c7c"/>
+      <w:rFonts w:ascii="Source Serif 4" w:hAnsi="Source Serif 4" w:eastAsia="Source Serif 4" w:cs="Source Serif 4"/>
+      <w:sz w:val="28"/>
+      <w:szCs w:val="28"/>
+      <w:color w:val="2C2823"/>
     </w:rPr>
     <w:pPr>
       <w:spacing w:before="120" w:after="120"/>
@@ -3700,12 +3696,10 @@
       <w:jc w:val="center"/>
     </w:pPr>
     <w:rPr>
-      <w:i/>
-      <w:iCs/>
-      <w:rFonts w:ascii="Source Sans 3" w:hAnsi="Source Sans 3" w:eastAsia="Source Sans 3" w:cs="Source Sans 3"/>
-      <w:sz w:val="22"/>
-      <w:szCs w:val="22"/>
-      <w:color w:val="266798"/>
+      <w:rFonts w:ascii="Source Serif 4" w:hAnsi="Source Serif 4" w:eastAsia="Source Serif 4" w:cs="Source Serif 4"/>
+      <w:sz w:val="34"/>
+      <w:szCs w:val="34"/>
+      <w:color w:val="015C9C"/>
     </w:rPr>
   </w:style>
   <w:style w:type="character" w:customStyle="1" w:styleId="IntenseQuoteChar">
@@ -3715,12 +3709,10 @@
     <w:uiPriority w:val="30"/>
     <w:rsid w:val="00B04F2E"/>
     <w:rPr>
-      <w:i/>
-      <w:iCs/>
-      <w:rFonts w:ascii="Source Sans 3" w:hAnsi="Source Sans 3" w:eastAsia="Source Sans 3" w:cs="Source Sans 3"/>
-      <w:sz w:val="22"/>
-      <w:szCs w:val="22"/>
-      <w:color w:val="266798"/>
+      <w:rFonts w:ascii="Source Serif 4" w:hAnsi="Source Serif 4" w:eastAsia="Source Serif 4" w:cs="Source Serif 4"/>
+      <w:sz w:val="34"/>
+      <w:szCs w:val="34"/>
+      <w:color w:val="015C9C"/>
     </w:rPr>
     <w:pPr>
       <w:spacing w:before="120" w:after="120"/>
@@ -3755,10 +3747,10 @@
       <w:spacing w:after="0"/>
     </w:pPr>
     <w:rPr>
-      <w:rFonts w:ascii="JetBrains Mono" w:hAnsi="JetBrains Mono" w:eastAsia="JetBrains Mono" w:cs="JetBrains Mono"/>
-      <w:sz w:val="16"/>
-      <w:szCs w:val="16"/>
-      <w:color w:val="7c7c7c"/>
+      <w:rFonts w:ascii="Inter" w:hAnsi="Inter" w:eastAsia="Inter" w:cs="Inter"/>
+      <w:sz w:val="18"/>
+      <w:szCs w:val="18"/>
+      <w:color w:val="6B645A"/>
     </w:rPr>
   </w:style>
   <w:style w:type="character" w:customStyle="1" w:styleId="HeaderChar">
@@ -3783,10 +3775,10 @@
       <w:spacing w:after="0"/>
     </w:pPr>
     <w:rPr>
-      <w:rFonts w:ascii="JetBrains Mono" w:hAnsi="JetBrains Mono" w:eastAsia="JetBrains Mono" w:cs="JetBrains Mono"/>
-      <w:sz w:val="16"/>
-      <w:szCs w:val="16"/>
-      <w:color w:val="7c7c7c"/>
+      <w:rFonts w:ascii="Inter" w:hAnsi="Inter" w:eastAsia="Inter" w:cs="Inter"/>
+      <w:sz w:val="18"/>
+      <w:szCs w:val="18"/>
+      <w:color w:val="6B645A"/>
     </w:rPr>
   </w:style>
   <w:style w:type="character" w:customStyle="1" w:styleId="FooterChar">
@@ -3967,12 +3959,12 @@
       <w:spacing w:after="60"/>
     </w:pPr>
     <w:rPr>
-      <w:rFonts w:ascii="Source Sans 3" w:hAnsi="Source Sans 3" w:eastAsia="Source Sans 3" w:cs="Source Sans 3"/>
+      <w:rFonts w:ascii="Inter" w:hAnsi="Inter" w:eastAsia="Inter" w:cs="Inter"/>
       <w:kern w:val="0"/>
       <w:lang w:eastAsia="ja-JP"/>
       <w:sz w:val="18"/>
       <w:szCs w:val="18"/>
-      <w:color w:val="7c7c7c"/>
+      <w:color w:val="6B645A"/>
     </w:rPr>
   </w:style>
   <w:style w:type="character" w:customStyle="1" w:styleId="FootnoteTextChar">
@@ -3982,12 +3974,12 @@
     <w:uiPriority w:val="99"/>
     <w:rsid w:val="00CB55B5"/>
     <w:rPr>
-      <w:rFonts w:ascii="Source Sans 3" w:hAnsi="Source Sans 3" w:eastAsia="Source Sans 3" w:cs="Source Sans 3"/>
+      <w:rFonts w:ascii="Inter" w:hAnsi="Inter" w:eastAsia="Inter" w:cs="Inter"/>
       <w:kern w:val="0"/>
       <w:lang w:eastAsia="ja-JP"/>
       <w:sz w:val="18"/>
       <w:szCs w:val="18"/>
-      <w:color w:val="7c7c7c"/>
+      <w:color w:val="6B645A"/>
     </w:rPr>
     <w:pPr>
       <w:spacing w:after="60"/>
@@ -4027,12 +4019,14 @@
       <w:spacing w:before="60" w:after="120"/>
     </w:pPr>
     <w:rPr>
-      <w:rFonts w:ascii="JetBrains Mono" w:hAnsi="JetBrains Mono" w:eastAsia="JetBrains Mono" w:cs="JetBrains Mono"/>
+      <w:i/>
+      <w:iCs/>
+      <w:rFonts w:ascii="Source Serif 4" w:hAnsi="Source Serif 4" w:eastAsia="Source Serif 4" w:cs="Source Serif 4"/>
       <w:kern w:val="0"/>
       <w14:ligatures w14:val="none"/>
-      <w:sz w:val="17"/>
-      <w:szCs w:val="17"/>
-      <w:color w:val="7c7c7c"/>
+      <w:sz w:val="20"/>
+      <w:szCs w:val="20"/>
+      <w:color w:val="2C2823"/>
     </w:rPr>
   </w:style>
   <w:style w:type="paragraph" w:customStyle="1" w:styleId="Source">
@@ -4044,10 +4038,10 @@
     <w:rPr>
       <w:i/>
       <w:iCs/>
-      <w:rFonts w:ascii="JetBrains Mono" w:hAnsi="JetBrains Mono" w:eastAsia="JetBrains Mono" w:cs="JetBrains Mono"/>
-      <w:sz w:val="17"/>
-      <w:szCs w:val="17"/>
-      <w:color w:val="7c7c7c"/>
+      <w:rFonts w:ascii="Source Serif 4" w:hAnsi="Source Serif 4" w:eastAsia="Source Serif 4" w:cs="Source Serif 4"/>
+      <w:sz w:val="20"/>
+      <w:szCs w:val="20"/>
+      <w:color w:val="2C2823"/>
     </w:rPr>
     <w:pPr>
       <w:spacing w:before="60" w:after="240"/>
@@ -4061,10 +4055,10 @@
     <w:rPr>
       <w:i/>
       <w:iCs/>
-      <w:rFonts w:ascii="JetBrains Mono" w:hAnsi="JetBrains Mono" w:eastAsia="JetBrains Mono" w:cs="JetBrains Mono"/>
-      <w:sz w:val="17"/>
-      <w:szCs w:val="17"/>
-      <w:color w:val="7c7c7c"/>
+      <w:rFonts w:ascii="Source Serif 4" w:hAnsi="Source Serif 4" w:eastAsia="Source Serif 4" w:cs="Source Serif 4"/>
+      <w:sz w:val="20"/>
+      <w:szCs w:val="20"/>
+      <w:color w:val="2C2823"/>
     </w:rPr>
     <w:pPr>
       <w:spacing w:before="60" w:after="240"/>
@@ -4137,17 +4131,17 @@
     <w:rsid w:val="00355818"/>
     <w:pPr>
       <w:pageBreakBefore/>
-      <w:spacing w:before="480" w:after="120" w:line="259" w:lineRule="auto"/>
+      <w:spacing w:before="480" w:after="160" w:line="259" w:lineRule="auto"/>
       <w:outlineLvl w:val="9"/>
     </w:pPr>
     <w:rPr>
       <w:b/>
       <w:bCs/>
-      <w:rFonts w:ascii="Source Sans 3" w:hAnsi="Source Sans 3" w:eastAsia="Source Sans 3" w:cs="Source Sans 3"/>
+      <w:rFonts w:ascii="Source Serif 4" w:hAnsi="Source Serif 4" w:eastAsia="Source Serif 4" w:cs="Source Serif 4"/>
       <w:kern w:val="0"/>
-      <w:sz w:val="34"/>
-      <w:szCs w:val="34"/>
-      <w:color w:val="333333"/>
+      <w:sz w:val="68"/>
+      <w:szCs w:val="68"/>
+      <w:color w:val="1A1714"/>
     </w:rPr>
   </w:style>
   <w:style w:type="paragraph" w:styleId="TOC1">
@@ -4167,11 +4161,11 @@
     <w:rPr>
       <w:b/>
       <w:bCs/>
-      <w:rFonts w:ascii="Source Sans 3" w:hAnsi="Source Sans 3" w:eastAsia="Source Sans 3" w:cs="Source Sans 3"/>
+      <w:rFonts w:ascii="Source Serif 4" w:hAnsi="Source Serif 4" w:eastAsia="Source Serif 4" w:cs="Source Serif 4"/>
       <w:noProof/>
-      <w:sz w:val="22"/>
-      <w:szCs w:val="22"/>
-      <w:color w:val="333333"/>
+      <w:sz w:val="28"/>
+      <w:szCs w:val="28"/>
+      <w:color w:val="1A1714"/>
     </w:rPr>
   </w:style>
   <w:style w:type="paragraph" w:styleId="TOC2">
@@ -4187,10 +4181,10 @@
       <w:spacing w:before="60" w:after="60"/>
     </w:pPr>
     <w:rPr>
-      <w:rFonts w:ascii="Source Sans 3" w:hAnsi="Source Sans 3" w:eastAsia="Source Sans 3" w:cs="Source Sans 3"/>
-      <w:sz w:val="22"/>
-      <w:szCs w:val="22"/>
-      <w:color w:val="333333"/>
+      <w:rFonts w:ascii="Inter" w:hAnsi="Inter" w:eastAsia="Inter" w:cs="Inter"/>
+      <w:sz w:val="24"/>
+      <w:szCs w:val="24"/>
+      <w:color w:val="2C2823"/>
     </w:rPr>
   </w:style>
   <w:style w:type="paragraph" w:styleId="TOC3">
@@ -4206,10 +4200,12 @@
       <w:spacing w:before="60" w:after="60"/>
     </w:pPr>
     <w:rPr>
-      <w:rFonts w:ascii="Source Sans 3" w:hAnsi="Source Sans 3" w:eastAsia="Source Sans 3" w:cs="Source Sans 3"/>
-      <w:sz w:val="20"/>
-      <w:szCs w:val="20"/>
-      <w:color w:val="7c7c7c"/>
+      <w:i/>
+      <w:iCs/>
+      <w:rFonts w:ascii="Inter" w:hAnsi="Inter" w:eastAsia="Inter" w:cs="Inter"/>
+      <w:sz w:val="24"/>
+      <w:szCs w:val="24"/>
+      <w:color w:val="6B645A"/>
     </w:rPr>
   </w:style>
   <w:style w:type="character" w:customStyle="1" w:styleId="cf01">
@@ -4248,12 +4244,12 @@
     <w:rPr>
       <w:b/>
       <w:bCs/>
-      <w:rFonts w:ascii="Source Sans 3" w:hAnsi="Source Sans 3" w:eastAsia="Source Sans 3" w:cs="Source Sans 3"/>
+      <w:rFonts w:ascii="Source Serif 4" w:hAnsi="Source Serif 4" w:eastAsia="Source Serif 4" w:cs="Source Serif 4"/>
       <w:kern w:val="0"/>
       <w14:ligatures w14:val="none"/>
-      <w:sz w:val="22"/>
-      <w:szCs w:val="22"/>
-      <w:color w:val="333333"/>
+      <w:sz w:val="28"/>
+      <w:szCs w:val="28"/>
+      <w:color w:val="1A1714"/>
     </w:rPr>
   </w:style>
   <w:style w:type="character" w:customStyle="1" w:styleId="FigureTitleChar">
@@ -4264,12 +4260,12 @@
     <w:rPr>
       <w:b/>
       <w:bCs/>
-      <w:rFonts w:ascii="Source Sans 3" w:hAnsi="Source Sans 3" w:eastAsia="Source Sans 3" w:cs="Source Sans 3"/>
+      <w:rFonts w:ascii="Source Serif 4" w:hAnsi="Source Serif 4" w:eastAsia="Source Serif 4" w:cs="Source Serif 4"/>
       <w:kern w:val="0"/>
       <w14:ligatures w14:val="none"/>
-      <w:sz w:val="22"/>
-      <w:szCs w:val="22"/>
-      <w:color w:val="333333"/>
+      <w:sz w:val="28"/>
+      <w:szCs w:val="28"/>
+      <w:color w:val="1A1714"/>
     </w:rPr>
     <w:pPr>
       <w:spacing w:before="240" w:after="60"/>
@@ -4295,10 +4291,10 @@
     <w:rPr>
       <w:i/>
       <w:iCs/>
-      <w:rFonts w:ascii="JetBrains Mono" w:hAnsi="JetBrains Mono" w:eastAsia="JetBrains Mono" w:cs="JetBrains Mono"/>
-      <w:sz w:val="17"/>
-      <w:szCs w:val="17"/>
-      <w:color w:val="7c7c7c"/>
+      <w:rFonts w:ascii="Source Serif 4" w:hAnsi="Source Serif 4" w:eastAsia="Source Serif 4" w:cs="Source Serif 4"/>
+      <w:sz w:val="20"/>
+      <w:szCs w:val="20"/>
+      <w:color w:val="2C2823"/>
     </w:rPr>
   </w:style>
   <w:style w:type="table" w:styleId="Table">
@@ -4328,52 +4324,52 @@
   <a:themeElements>
     <a:clrScheme name="Growth Lab">
       <a:dk1>
-        <a:sysClr val="windowText" lastClr="333333"/>
+        <a:sysClr val="windowText" lastClr="1A1714"/>
       </a:dk1>
       <a:lt1>
         <a:sysClr val="window" lastClr="FFFFFF"/>
       </a:lt1>
       <a:dk2>
-        <a:srgbClr val="266798"/>
+        <a:srgbClr val="015C9C"/>
       </a:dk2>
       <a:lt2>
-        <a:srgbClr val="F3F3F3"/>
+        <a:srgbClr val="F4F1EA"/>
       </a:lt2>
       <a:accent1>
-        <a:srgbClr val="266798"/>
+        <a:srgbClr val="015C9C"/>
       </a:accent1>
       <a:accent2>
-        <a:srgbClr val="C64646"/>
+        <a:srgbClr val="C77A20"/>
       </a:accent2>
       <a:accent3>
-        <a:srgbClr val="36B250"/>
+        <a:srgbClr val="CEC96B"/>
       </a:accent3>
       <a:accent4>
-        <a:srgbClr val="EAC218"/>
+        <a:srgbClr val="51B196"/>
       </a:accent4>
       <a:accent5>
-        <a:srgbClr val="D1852A"/>
+        <a:srgbClr val="A8352C"/>
       </a:accent5>
       <a:accent6>
-        <a:srgbClr val="52E2DE"/>
+        <a:srgbClr val="918BED"/>
       </a:accent6>
       <a:hlink>
-        <a:srgbClr val="266798"/>
+        <a:srgbClr val="015C9C"/>
       </a:hlink>
       <a:folHlink>
-        <a:srgbClr val="7c7c7c"/>
+        <a:srgbClr val="6B645A"/>
       </a:folHlink>
     </a:clrScheme>
     <a:fontScheme name="Growth Lab">
       <a:majorFont>
-        <a:latin typeface="Source Sans 3"/>
+        <a:latin typeface="Source Serif 4"/>
         <a:ea typeface=""/>
         <a:cs typeface=""/>
         <a:font script="Arab" typeface="Arial"/>
         <a:font script="Hebr" typeface="Arial"/>
       </a:majorFont>
       <a:minorFont>
-        <a:latin typeface="Source Sans 3"/>
+        <a:latin typeface="Inter"/>
         <a:ea typeface=""/>
         <a:cs typeface=""/>
         <a:font script="Arab" typeface="Arial"/>

</xml_diff>